<commit_message>
Pushing all assign module 1 3/17/26
</commit_message>
<xml_diff>
--- a/module-1/hughes_assign1.2.docx
+++ b/module-1/hughes_assign1.2.docx
@@ -9,18 +9,63 @@
     </w:p>
     <w:p>
       <w:r>
+        <w:t>3/14/26</w:t>
+      </w:r>
+    </w:p>
+    <w:p>
+      <w:r>
         <w:t>Module 1.2 Assignment</w:t>
       </w:r>
     </w:p>
     <w:p/>
     <w:p/>
+    <w:p>
+      <w:r>
+        <w:rPr>
+          <w:b/>
+          <w:bCs/>
+          <w:u w:val="single"/>
+        </w:rPr>
+        <w:t>Link to Git-Hub:</w:t>
+      </w:r>
+      <w:r>
+        <w:br/>
+      </w:r>
+      <w:r>
+        <w:br/>
+      </w:r>
+      <w:r>
+        <w:t>https://github.com/CyberGuyKy/csd-325</w:t>
+      </w:r>
+    </w:p>
     <w:p/>
     <w:p>
+      <w:pPr>
+        <w:rPr>
+          <w:b/>
+          <w:bCs/>
+          <w:u w:val="single"/>
+        </w:rPr>
+      </w:pPr>
       <w:r>
+        <w:rPr>
+          <w:b/>
+          <w:bCs/>
+          <w:u w:val="single"/>
+        </w:rPr>
+        <w:t>Screenshot of local directory:</w:t>
+      </w:r>
+    </w:p>
+    <w:p>
+      <w:r>
+        <w:rPr>
+          <w:noProof/>
+        </w:rPr>
+        <w:lastRenderedPageBreak/>
         <w:drawing>
-          <wp:inline distT="0" distB="0" distL="0" distR="0" wp14:anchorId="0FA3198F" wp14:editId="33164E1A">
-            <wp:extent cx="5943600" cy="6148705"/>
-            <wp:effectExtent l="0" t="0" r="0" b="0"/>
+          <wp:inline distT="0" distB="0" distL="0" distR="0" wp14:anchorId="0FA3198F" wp14:editId="7C156DAB">
+            <wp:extent cx="5114622" cy="5291120"/>
+            <wp:effectExtent l="0" t="0" r="0" b="5080"/>
             <wp:docPr id="634498536" name="Picture 1"/>
             <wp:cNvGraphicFramePr>
               <a:graphicFrameLocks xmlns:a="http://schemas.openxmlformats.org/drawingml/2006/main" noChangeAspect="1"/>
@@ -41,7 +86,109 @@
                   <pic:spPr>
                     <a:xfrm>
                       <a:off x="0" y="0"/>
-                      <a:ext cx="5943600" cy="6148705"/>
+                      <a:ext cx="5118179" cy="5294800"/>
+                    </a:xfrm>
+                    <a:prstGeom prst="rect">
+                      <a:avLst/>
+                    </a:prstGeom>
+                  </pic:spPr>
+                </pic:pic>
+              </a:graphicData>
+            </a:graphic>
+          </wp:inline>
+        </w:drawing>
+      </w:r>
+    </w:p>
+    <w:p>
+      <w:pPr>
+        <w:rPr>
+          <w:b/>
+          <w:bCs/>
+          <w:u w:val="single"/>
+        </w:rPr>
+      </w:pPr>
+      <w:r>
+        <w:rPr>
+          <w:b/>
+          <w:bCs/>
+          <w:u w:val="single"/>
+        </w:rPr>
+        <w:t>Screenshot of Git-Hub repository:</w:t>
+      </w:r>
+    </w:p>
+    <w:p>
+      <w:r>
+        <w:rPr>
+          <w:noProof/>
+        </w:rPr>
+        <w:lastRenderedPageBreak/>
+        <w:drawing>
+          <wp:inline distT="0" distB="0" distL="0" distR="0" wp14:anchorId="1F08FFE5" wp14:editId="0925D22F">
+            <wp:extent cx="5943600" cy="3228975"/>
+            <wp:effectExtent l="0" t="0" r="0" b="9525"/>
+            <wp:docPr id="450235605" name="Picture 1"/>
+            <wp:cNvGraphicFramePr>
+              <a:graphicFrameLocks xmlns:a="http://schemas.openxmlformats.org/drawingml/2006/main" noChangeAspect="1"/>
+            </wp:cNvGraphicFramePr>
+            <a:graphic xmlns:a="http://schemas.openxmlformats.org/drawingml/2006/main">
+              <a:graphicData uri="http://schemas.openxmlformats.org/drawingml/2006/picture">
+                <pic:pic xmlns:pic="http://schemas.openxmlformats.org/drawingml/2006/picture">
+                  <pic:nvPicPr>
+                    <pic:cNvPr id="450235605" name=""/>
+                    <pic:cNvPicPr/>
+                  </pic:nvPicPr>
+                  <pic:blipFill>
+                    <a:blip r:embed="rId5"/>
+                    <a:stretch>
+                      <a:fillRect/>
+                    </a:stretch>
+                  </pic:blipFill>
+                  <pic:spPr>
+                    <a:xfrm>
+                      <a:off x="0" y="0"/>
+                      <a:ext cx="5943600" cy="3228975"/>
+                    </a:xfrm>
+                    <a:prstGeom prst="rect">
+                      <a:avLst/>
+                    </a:prstGeom>
+                  </pic:spPr>
+                </pic:pic>
+              </a:graphicData>
+            </a:graphic>
+          </wp:inline>
+        </w:drawing>
+      </w:r>
+    </w:p>
+    <w:p>
+      <w:r>
+        <w:rPr>
+          <w:noProof/>
+        </w:rPr>
+        <w:drawing>
+          <wp:inline distT="0" distB="0" distL="0" distR="0" wp14:anchorId="7BD74F69" wp14:editId="743BD004">
+            <wp:extent cx="5943600" cy="2270760"/>
+            <wp:effectExtent l="0" t="0" r="0" b="0"/>
+            <wp:docPr id="805920790" name="Picture 1"/>
+            <wp:cNvGraphicFramePr>
+              <a:graphicFrameLocks xmlns:a="http://schemas.openxmlformats.org/drawingml/2006/main" noChangeAspect="1"/>
+            </wp:cNvGraphicFramePr>
+            <a:graphic xmlns:a="http://schemas.openxmlformats.org/drawingml/2006/main">
+              <a:graphicData uri="http://schemas.openxmlformats.org/drawingml/2006/picture">
+                <pic:pic xmlns:pic="http://schemas.openxmlformats.org/drawingml/2006/picture">
+                  <pic:nvPicPr>
+                    <pic:cNvPr id="805920790" name=""/>
+                    <pic:cNvPicPr/>
+                  </pic:nvPicPr>
+                  <pic:blipFill>
+                    <a:blip r:embed="rId6"/>
+                    <a:stretch>
+                      <a:fillRect/>
+                    </a:stretch>
+                  </pic:blipFill>
+                  <pic:spPr>
+                    <a:xfrm>
+                      <a:off x="0" y="0"/>
+                      <a:ext cx="5943600" cy="2270760"/>
                     </a:xfrm>
                     <a:prstGeom prst="rect">
                       <a:avLst/>

</xml_diff>